<commit_message>
docs: add 4-tier OLAM architecture diagram, star schema diagram, and 2-member workload division to slides, web app and report
</commit_message>
<xml_diff>
--- a/docs/report.docx
+++ b/docs/report.docx
@@ -427,6 +427,227 @@
     </w:p>
     <w:p>
       <w:pPr>
+        <w:spacing w:before="200" w:after="80"/>
+      </w:pPr>
+      <w:r>
+        <w:rPr>
+          <w:b/>
+          <w:color w:val="2563EB"/>
+          <w:sz w:val="26"/>
+        </w:rPr>
+        <w:t>1.3. Bảng phân công nhiệm vụ thành viên nhóm (Mô hình 2 người - Tỷ lệ 50% / 50%)</w:t>
+      </w:r>
+    </w:p>
+    <w:p>
+      <w:pPr>
+        <w:spacing w:after="80" w:line="288" w:lineRule="auto"/>
+      </w:pPr>
+      <w:r>
+        <w:t>Để đảm bảo chất lượng kỹ thuật cao nhất và phối hợp nhịp nhàng theo quy trình phát triển phần mềm chuẩn doanh nghiệp, nhóm phân chia trách nhiệm cụ thể như sau:</w:t>
+      </w:r>
+    </w:p>
+    <w:tbl>
+      <w:tblPr>
+        <w:tblW w:type="auto" w:w="0"/>
+        <w:jc w:val="center"/>
+        <w:tblLook w:firstColumn="1" w:firstRow="1" w:lastColumn="0" w:lastRow="0" w:noHBand="0" w:noVBand="1" w:val="04A0"/>
+      </w:tblPr>
+      <w:tblGrid>
+        <w:gridCol w:w="2340"/>
+        <w:gridCol w:w="2340"/>
+        <w:gridCol w:w="2340"/>
+        <w:gridCol w:w="2340"/>
+      </w:tblGrid>
+      <w:tr>
+        <w:tc>
+          <w:tcPr>
+            <w:tcW w:type="dxa" w:w="2340"/>
+            <w:shd w:val="clear" w:color="auto" w:fill="1E3A8A"/>
+          </w:tcPr>
+          <w:p>
+            <w:pPr>
+              <w:spacing w:before="80" w:after="80" w:line="276" w:lineRule="auto"/>
+            </w:pPr>
+            <w:r>
+              <w:rPr>
+                <w:b/>
+                <w:color w:val="FFFFFF"/>
+              </w:rPr>
+              <w:t>Thành viên</w:t>
+            </w:r>
+          </w:p>
+        </w:tc>
+        <w:tc>
+          <w:tcPr>
+            <w:tcW w:type="dxa" w:w="2340"/>
+            <w:shd w:val="clear" w:color="auto" w:fill="1E3A8A"/>
+          </w:tcPr>
+          <w:p>
+            <w:pPr>
+              <w:spacing w:before="80" w:after="80" w:line="276" w:lineRule="auto"/>
+            </w:pPr>
+            <w:r>
+              <w:rPr>
+                <w:b/>
+                <w:color w:val="FFFFFF"/>
+              </w:rPr>
+              <w:t>Vai trò chuyên môn</w:t>
+            </w:r>
+          </w:p>
+        </w:tc>
+        <w:tc>
+          <w:tcPr>
+            <w:tcW w:type="dxa" w:w="2340"/>
+            <w:shd w:val="clear" w:color="auto" w:fill="1E3A8A"/>
+          </w:tcPr>
+          <w:p>
+            <w:pPr>
+              <w:spacing w:before="80" w:after="80" w:line="276" w:lineRule="auto"/>
+            </w:pPr>
+            <w:r>
+              <w:rPr>
+                <w:b/>
+                <w:color w:val="FFFFFF"/>
+              </w:rPr>
+              <w:t>Nhiệm vụ đảm nhiệm chính</w:t>
+            </w:r>
+          </w:p>
+        </w:tc>
+        <w:tc>
+          <w:tcPr>
+            <w:tcW w:type="dxa" w:w="2340"/>
+            <w:shd w:val="clear" w:color="auto" w:fill="1E3A8A"/>
+          </w:tcPr>
+          <w:p>
+            <w:pPr>
+              <w:spacing w:before="80" w:after="80" w:line="276" w:lineRule="auto"/>
+            </w:pPr>
+            <w:r>
+              <w:rPr>
+                <w:b/>
+                <w:color w:val="FFFFFF"/>
+              </w:rPr>
+              <w:t>Tỷ lệ đóng góp</w:t>
+            </w:r>
+          </w:p>
+        </w:tc>
+      </w:tr>
+      <w:tr>
+        <w:tc>
+          <w:tcPr>
+            <w:tcW w:type="dxa" w:w="2340"/>
+            <w:shd w:val="clear" w:color="auto" w:fill="F8FAFC"/>
+          </w:tcPr>
+          <w:p>
+            <w:pPr>
+              <w:spacing w:before="80" w:after="80" w:line="276" w:lineRule="auto"/>
+            </w:pPr>
+            <w:r>
+              <w:t>Sinh viên 1 (Nhóm trưởng)</w:t>
+            </w:r>
+          </w:p>
+        </w:tc>
+        <w:tc>
+          <w:tcPr>
+            <w:tcW w:type="dxa" w:w="2340"/>
+            <w:shd w:val="clear" w:color="auto" w:fill="F8FAFC"/>
+          </w:tcPr>
+          <w:p>
+            <w:pPr>
+              <w:spacing w:before="80" w:after="80" w:line="276" w:lineRule="auto"/>
+            </w:pPr>
+            <w:r>
+              <w:t>Data Engineer &amp; Data Warehouse Architect</w:t>
+            </w:r>
+          </w:p>
+        </w:tc>
+        <w:tc>
+          <w:tcPr>
+            <w:tcW w:type="dxa" w:w="2340"/>
+            <w:shd w:val="clear" w:color="auto" w:fill="F8FAFC"/>
+          </w:tcPr>
+          <w:p>
+            <w:pPr>
+              <w:spacing w:before="80" w:after="80" w:line="276" w:lineRule="auto"/>
+            </w:pPr>
+            <w:r>
+              <w:t>• Khảo sát nguồn dữ liệu MovieLens 1M, streaming IMDb và Netflix catalog.&lt;br&gt;• Thiết kế Lược đồ hình sao (Star Schema), xây dựng DDL SQL Server (`stg` &amp; `dw`).&lt;br&gt;• Lập trình pipeline ETL (`clean_and_match.py`, `load_dw.py`), nạp 1 triệu bản ghi.&lt;br&gt;• Xây dựng bộ kiểm toán chất lượng dữ liệu (Data Quality Audit 5/5 tiêu chí).&lt;br&gt;• Viết các truy vấn đa chiều OLAP (`ROLLUP`, `CUBE`, `LAG()` tính QoQ growth cho Q3).&lt;br&gt;• Đóng gói script tự động hóa `run_all.sh`, viết Chương 1, 2, 3 báo cáo.</w:t>
+            </w:r>
+          </w:p>
+        </w:tc>
+        <w:tc>
+          <w:tcPr>
+            <w:tcW w:type="dxa" w:w="2340"/>
+            <w:shd w:val="clear" w:color="auto" w:fill="F8FAFC"/>
+          </w:tcPr>
+          <w:p>
+            <w:pPr>
+              <w:spacing w:before="80" w:after="80" w:line="276" w:lineRule="auto"/>
+            </w:pPr>
+            <w:r>
+              <w:t>50%</w:t>
+            </w:r>
+          </w:p>
+        </w:tc>
+      </w:tr>
+      <w:tr>
+        <w:tc>
+          <w:tcPr>
+            <w:tcW w:type="dxa" w:w="2340"/>
+          </w:tcPr>
+          <w:p>
+            <w:pPr>
+              <w:spacing w:before="80" w:after="80" w:line="276" w:lineRule="auto"/>
+            </w:pPr>
+            <w:r>
+              <w:t>Sinh viên 2 (Thành viên)</w:t>
+            </w:r>
+          </w:p>
+        </w:tc>
+        <w:tc>
+          <w:tcPr>
+            <w:tcW w:type="dxa" w:w="2340"/>
+          </w:tcPr>
+          <w:p>
+            <w:pPr>
+              <w:spacing w:before="80" w:after="80" w:line="276" w:lineRule="auto"/>
+            </w:pPr>
+            <w:r>
+              <w:t>Data Scientist &amp; BI / Machine Learning Engineer</w:t>
+            </w:r>
+          </w:p>
+        </w:tc>
+        <w:tc>
+          <w:tcPr>
+            <w:tcW w:type="dxa" w:w="2340"/>
+          </w:tcPr>
+          <w:p>
+            <w:pPr>
+              <w:spacing w:before="80" w:after="80" w:line="276" w:lineRule="auto"/>
+            </w:pPr>
+            <w:r>
+              <w:t>• Trích xuất vector đặc trưng sở thích người dùng 36 chiều (tỷ lệ xem &amp; rating thể loại).&lt;br&gt;• Huấn luyện mô hình phân cụm K-Means ($K=4$), phân tích Elbow, Silhouette, PCA 2D.&lt;br&gt;• Thực hiện kiểm định thống kê Chi-Square ($\chi^2$) mối quan hệ Giới tính &amp; Nhóm tuổi cho Q1.&lt;br&gt;• Xây dựng hệ gợi ý Item-based Collaborative Filtering và khai phá FP-Growth đạo diễn cho Q2.&lt;br&gt;• Thiết kế giao diện tương tác Web App Streamlit (`streamlit_app.py`) và Power BI Desktop.&lt;br&gt;• Thiết kế slide thuyết trình PowerPoint, viết Chương 4, 5, 6 báo cáo học thuật.</w:t>
+            </w:r>
+          </w:p>
+        </w:tc>
+        <w:tc>
+          <w:tcPr>
+            <w:tcW w:type="dxa" w:w="2340"/>
+          </w:tcPr>
+          <w:p>
+            <w:pPr>
+              <w:spacing w:before="80" w:after="80" w:line="276" w:lineRule="auto"/>
+            </w:pPr>
+            <w:r>
+              <w:t>50%</w:t>
+            </w:r>
+          </w:p>
+        </w:tc>
+      </w:tr>
+    </w:tbl>
+    <w:p/>
+    <w:p>
+      <w:pPr>
         <w:spacing w:before="120" w:after="120"/>
       </w:pPr>
     </w:p>
@@ -609,6 +830,59 @@
       </w:r>
       <w:r>
         <w:t xml:space="preserve"> Ứng dụng web Streamlit trực quan và Dashboard thương mại điện tử trên Power BI Desktop.</w:t>
+      </w:r>
+    </w:p>
+    <w:p>
+      <w:pPr>
+        <w:jc w:val="center"/>
+      </w:pPr>
+      <w:r>
+        <w:drawing>
+          <wp:inline xmlns:a="http://schemas.openxmlformats.org/drawingml/2006/main" xmlns:pic="http://schemas.openxmlformats.org/drawingml/2006/picture">
+            <wp:extent cx="5486400" cy="3118170"/>
+            <wp:docPr id="1" name="Picture 1"/>
+            <wp:cNvGraphicFramePr>
+              <a:graphicFrameLocks noChangeAspect="1"/>
+            </wp:cNvGraphicFramePr>
+            <a:graphic>
+              <a:graphicData uri="http://schemas.openxmlformats.org/drawingml/2006/picture">
+                <pic:pic>
+                  <pic:nvPicPr>
+                    <pic:cNvPr id="0" name="system_architecture.png"/>
+                    <pic:cNvPicPr/>
+                  </pic:nvPicPr>
+                  <pic:blipFill>
+                    <a:blip r:embed="rId9"/>
+                    <a:stretch>
+                      <a:fillRect/>
+                    </a:stretch>
+                  </pic:blipFill>
+                  <pic:spPr>
+                    <a:xfrm>
+                      <a:off x="0" y="0"/>
+                      <a:ext cx="5486400" cy="3118170"/>
+                    </a:xfrm>
+                    <a:prstGeom prst="rect"/>
+                  </pic:spPr>
+                </pic:pic>
+              </a:graphicData>
+            </a:graphic>
+          </wp:inline>
+        </w:drawing>
+      </w:r>
+    </w:p>
+    <w:p>
+      <w:pPr>
+        <w:spacing w:after="160"/>
+        <w:jc w:val="center"/>
+      </w:pPr>
+      <w:r>
+        <w:rPr>
+          <w:i/>
+          <w:color w:val="64748B"/>
+          <w:sz w:val="20"/>
+        </w:rPr>
+        <w:t>Hình: Sơ đồ kiến trúc tổng thể hệ thống 4 tầng OLAM</w:t>
       </w:r>
     </w:p>
     <w:p>
@@ -1644,6 +1918,59 @@
       </w:r>
       <w:r>
         <w:t>.</w:t>
+      </w:r>
+    </w:p>
+    <w:p>
+      <w:pPr>
+        <w:jc w:val="center"/>
+      </w:pPr>
+      <w:r>
+        <w:drawing>
+          <wp:inline xmlns:a="http://schemas.openxmlformats.org/drawingml/2006/main" xmlns:pic="http://schemas.openxmlformats.org/drawingml/2006/picture">
+            <wp:extent cx="5486400" cy="3118170"/>
+            <wp:docPr id="2" name="Picture 2"/>
+            <wp:cNvGraphicFramePr>
+              <a:graphicFrameLocks noChangeAspect="1"/>
+            </wp:cNvGraphicFramePr>
+            <a:graphic>
+              <a:graphicData uri="http://schemas.openxmlformats.org/drawingml/2006/picture">
+                <pic:pic>
+                  <pic:nvPicPr>
+                    <pic:cNvPr id="0" name="star_schema_diagram.png"/>
+                    <pic:cNvPicPr/>
+                  </pic:nvPicPr>
+                  <pic:blipFill>
+                    <a:blip r:embed="rId10"/>
+                    <a:stretch>
+                      <a:fillRect/>
+                    </a:stretch>
+                  </pic:blipFill>
+                  <pic:spPr>
+                    <a:xfrm>
+                      <a:off x="0" y="0"/>
+                      <a:ext cx="5486400" cy="3118170"/>
+                    </a:xfrm>
+                    <a:prstGeom prst="rect"/>
+                  </pic:spPr>
+                </pic:pic>
+              </a:graphicData>
+            </a:graphic>
+          </wp:inline>
+        </w:drawing>
+      </w:r>
+    </w:p>
+    <w:p>
+      <w:pPr>
+        <w:spacing w:after="160"/>
+        <w:jc w:val="center"/>
+      </w:pPr>
+      <w:r>
+        <w:rPr>
+          <w:i/>
+          <w:color w:val="64748B"/>
+          <w:sz w:val="20"/>
+        </w:rPr>
+        <w:t>Hình: Sơ đồ Lược đồ hình sao Star Schema ERD</w:t>
       </w:r>
     </w:p>
     <w:p>

</xml_diff>